<commit_message>
Actualizar fichas v3: ampliación sin código, solo enunciado + pista
</commit_message>
<xml_diff>
--- a/1ESO/S02-el-guardian-de-la-puerta/ficha-reto.docx
+++ b/1ESO/S02-el-guardian-de-la-puerta/ficha-reto.docx
@@ -833,13 +833,13 @@
         </w:tblBorders>
       </w:tblPr>
       <w:tblGrid>
-        <w:gridCol w:w="2800"/>
-        <w:gridCol w:w="6838"/>
+        <w:gridCol w:w="3200"/>
+        <w:gridCol w:w="6438"/>
       </w:tblGrid>
       <w:tr>
         <w:tc>
           <w:tcPr>
-            <w:tcW w:type="dxa" w:w="2800"/>
+            <w:tcW w:type="dxa" w:w="3200"/>
             <w:tcBorders>
               <w:top w:val="single" w:color="CCCCCC" w:sz="1"/>
               <w:left w:val="single" w:color="CCCCCC" w:sz="1"/>
@@ -873,7 +873,7 @@
         </w:tc>
         <w:tc>
           <w:tcPr>
-            <w:tcW w:type="dxa" w:w="6838"/>
+            <w:tcW w:type="dxa" w:w="6438"/>
             <w:tcBorders>
               <w:top w:val="single" w:color="CCCCCC" w:sz="1"/>
               <w:left w:val="single" w:color="CCCCCC" w:sz="1"/>
@@ -905,7 +905,7 @@
       <w:tr>
         <w:tc>
           <w:tcPr>
-            <w:tcW w:type="dxa" w:w="2800"/>
+            <w:tcW w:type="dxa" w:w="3200"/>
             <w:tcBorders>
               <w:top w:val="single" w:color="CCCCCC" w:sz="1"/>
               <w:left w:val="single" w:color="CCCCCC" w:sz="1"/>
@@ -939,7 +939,7 @@
         </w:tc>
         <w:tc>
           <w:tcPr>
-            <w:tcW w:type="dxa" w:w="6838"/>
+            <w:tcW w:type="dxa" w:w="6438"/>
             <w:tcBorders>
               <w:top w:val="single" w:color="CCCCCC" w:sz="1"/>
               <w:left w:val="single" w:color="CCCCCC" w:sz="1"/>
@@ -971,7 +971,7 @@
       <w:tr>
         <w:tc>
           <w:tcPr>
-            <w:tcW w:type="dxa" w:w="2800"/>
+            <w:tcW w:type="dxa" w:w="3200"/>
             <w:tcBorders>
               <w:top w:val="single" w:color="CCCCCC" w:sz="1"/>
               <w:left w:val="single" w:color="CCCCCC" w:sz="1"/>
@@ -1005,7 +1005,7 @@
         </w:tc>
         <w:tc>
           <w:tcPr>
-            <w:tcW w:type="dxa" w:w="6838"/>
+            <w:tcW w:type="dxa" w:w="6438"/>
             <w:tcBorders>
               <w:top w:val="single" w:color="CCCCCC" w:sz="1"/>
               <w:left w:val="single" w:color="CCCCCC" w:sz="1"/>
@@ -1037,7 +1037,7 @@
       <w:tr>
         <w:tc>
           <w:tcPr>
-            <w:tcW w:type="dxa" w:w="2800"/>
+            <w:tcW w:type="dxa" w:w="3200"/>
             <w:tcBorders>
               <w:top w:val="single" w:color="CCCCCC" w:sz="1"/>
               <w:left w:val="single" w:color="CCCCCC" w:sz="1"/>
@@ -1071,7 +1071,7 @@
         </w:tc>
         <w:tc>
           <w:tcPr>
-            <w:tcW w:type="dxa" w:w="6838"/>
+            <w:tcW w:type="dxa" w:w="6438"/>
             <w:tcBorders>
               <w:top w:val="single" w:color="CCCCCC" w:sz="1"/>
               <w:left w:val="single" w:color="CCCCCC" w:sz="1"/>
@@ -1103,7 +1103,7 @@
       <w:tr>
         <w:tc>
           <w:tcPr>
-            <w:tcW w:type="dxa" w:w="2800"/>
+            <w:tcW w:type="dxa" w:w="3200"/>
             <w:tcBorders>
               <w:top w:val="single" w:color="CCCCCC" w:sz="1"/>
               <w:left w:val="single" w:color="CCCCCC" w:sz="1"/>
@@ -1137,7 +1137,7 @@
         </w:tc>
         <w:tc>
           <w:tcPr>
-            <w:tcW w:type="dxa" w:w="6838"/>
+            <w:tcW w:type="dxa" w:w="6438"/>
             <w:tcBorders>
               <w:top w:val="single" w:color="CCCCCC" w:sz="1"/>
               <w:left w:val="single" w:color="CCCCCC" w:sz="1"/>
@@ -1511,7 +1511,7 @@
                 <w:sz w:val="22"/>
                 <w:szCs w:val="22"/>
               </w:rPr>
-              <w:t xml:space="preserve">🟣  Enlace de entrega — pega aquí el enlace de tu proyecto en Scratch:</w:t>
+              <w:t xml:space="preserve">🟣  Enlace de entrega — pega aquí el enlace de tu proyecto:</w:t>
             </w:r>
           </w:p>
           <w:p>
@@ -1619,12 +1619,12 @@
           <w:sz w:val="22"/>
           <w:szCs w:val="22"/>
         </w:rPr>
-        <w:t xml:space="preserve">El guardián ahora solo grita. ¿Puedes hacer que además cambie de color cuando detecta al intruso? Y si te atreves con el reto difícil: añade un marcador de puntos. Cada vez que el guardián pille al intruso, el contador sube 1. Necesitarás una variable. Búscala en la sección "Variables" de Scratch.</w:t>
-      </w:r>
-    </w:p>
-    <w:p>
-      <w:pPr>
-        <w:spacing w:after="60" w:before="60"/>
+        <w:t xml:space="preserve">El guardián ahora solo grita. ¿Puedes añadir un marcador que cuente cuántas veces ha pillado al intruso? El marcador debe aparecer visible en el escenario y actualizarse cada vez que se produce la detección.</w:t>
+      </w:r>
+    </w:p>
+    <w:p>
+      <w:pPr>
+        <w:spacing w:after="100" w:before="100"/>
       </w:pPr>
       <w:r>
         <w:t xml:space="preserve"/>
@@ -1657,87 +1657,40 @@
             </w:tcBorders>
             <w:shd w:fill="EEF2FF" w:val="clear"/>
             <w:tcMar>
-              <w:top w:type="dxa" w:w="100"/>
+              <w:top w:type="dxa" w:w="120"/>
               <w:left w:type="dxa" w:w="200"/>
-              <w:bottom w:type="dxa" w:w="100"/>
+              <w:bottom w:type="dxa" w:w="120"/>
               <w:right w:type="dxa" w:w="200"/>
             </w:tcMar>
           </w:tcPr>
           <w:p>
-            <w:r>
-              <w:rPr>
-                <w:rFonts w:ascii="Courier New" w:cs="Courier New" w:eastAsia="Courier New" w:hAnsi="Courier New"/>
+            <w:pPr>
+              <w:spacing w:after="80" w:before="80"/>
+            </w:pPr>
+            <w:r>
+              <w:rPr>
+                <w:rFonts w:ascii="Arial" w:cs="Arial" w:eastAsia="Arial" w:hAnsi="Arial"/>
+                <w:b/>
+                <w:bCs/>
+                <w:color w:val="3730A3"/>
+                <w:sz w:val="20"/>
+                <w:szCs w:val="20"/>
+              </w:rPr>
+              <w:t xml:space="preserve">💡 Pista:</w:t>
+            </w:r>
+          </w:p>
+          <w:p>
+            <w:pPr>
+              <w:spacing w:after="80" w:before="80"/>
+            </w:pPr>
+            <w:r>
+              <w:rPr>
+                <w:rFonts w:ascii="Arial" w:cs="Arial" w:eastAsia="Arial" w:hAnsi="Arial"/>
                 <w:color w:val="312E81"/>
-                <w:sz w:val="19"/>
-                <w:szCs w:val="19"/>
-              </w:rPr>
-              <w:t xml:space="preserve">── Crear variable "Puntos" ──</w:t>
-            </w:r>
-          </w:p>
-          <w:p>
-            <w:r>
-              <w:rPr>
-                <w:rFonts w:ascii="Courier New" w:cs="Courier New" w:eastAsia="Courier New" w:hAnsi="Courier New"/>
-                <w:color w:val="312E81"/>
-                <w:sz w:val="19"/>
-                <w:szCs w:val="19"/>
-              </w:rPr>
-              <w:t xml:space="preserve">al hacer clic en 🚩</w:t>
-            </w:r>
-          </w:p>
-          <w:p>
-            <w:r>
-              <w:rPr>
-                <w:rFonts w:ascii="Courier New" w:cs="Courier New" w:eastAsia="Courier New" w:hAnsi="Courier New"/>
-                <w:color w:val="312E81"/>
-                <w:sz w:val="19"/>
-                <w:szCs w:val="19"/>
-              </w:rPr>
-              <w:t xml:space="preserve">    fijar [Puntos] a [0]</w:t>
-            </w:r>
-          </w:p>
-          <w:p>
-            <w:r>
-              <w:rPr>
-                <w:rFonts w:ascii="Courier New" w:cs="Courier New" w:eastAsia="Courier New" w:hAnsi="Courier New"/>
-                <w:color w:val="312E81"/>
-                <w:sz w:val="19"/>
-                <w:szCs w:val="19"/>
-              </w:rPr>
-              <w:t xml:space="preserve">    repetir siempre</w:t>
-            </w:r>
-          </w:p>
-          <w:p>
-            <w:r>
-              <w:rPr>
-                <w:rFonts w:ascii="Courier New" w:cs="Courier New" w:eastAsia="Courier New" w:hAnsi="Courier New"/>
-                <w:color w:val="312E81"/>
-                <w:sz w:val="19"/>
-                <w:szCs w:val="19"/>
-              </w:rPr>
-              <w:t xml:space="preserve">        si &lt;¿tocando [Intruso]?&gt; entonces</w:t>
-            </w:r>
-          </w:p>
-          <w:p>
-            <w:r>
-              <w:rPr>
-                <w:rFonts w:ascii="Courier New" w:cs="Courier New" w:eastAsia="Courier New" w:hAnsi="Courier New"/>
-                <w:color w:val="312E81"/>
-                <w:sz w:val="19"/>
-                <w:szCs w:val="19"/>
-              </w:rPr>
-              <w:t xml:space="preserve">            cambiar [Puntos] en [1]</w:t>
-            </w:r>
-          </w:p>
-          <w:p>
-            <w:r>
-              <w:rPr>
-                <w:rFonts w:ascii="Courier New" w:cs="Courier New" w:eastAsia="Courier New" w:hAnsi="Courier New"/>
-                <w:color w:val="312E81"/>
-                <w:sz w:val="19"/>
-                <w:szCs w:val="19"/>
-              </w:rPr>
-              <w:t xml:space="preserve">            decir [¡Alto ahí!] durante [1] segundos</w:t>
+                <w:sz w:val="20"/>
+                <w:szCs w:val="20"/>
+              </w:rPr>
+              <w:t xml:space="preserve">En Scratch, los marcadores se hacen con variables. Crea una variable llamada "Puntos" y busca los bloques para cambiar su valor y mostrarlo en pantalla. Recuerda ponerla a cero al inicio del programa.</w:t>
             </w:r>
           </w:p>
         </w:tc>

</xml_diff>